<commit_message>
Giao hàng theo đợt: chọn số lần giao, mỗi đợt nhân viên điền số ngày + tuỳ chọn câu 'hoặc 02 ngày kể từ thanh toán phần còn lại'; mẫu dùng {giao}
Co-Authored-By: Claude Opus 5.5 <noreply@anthropic.com>
Claude-Session: https://claude.ai/code/session_01DCUpzMkN9iGnXKaCEnHwQt
</commit_message>
<xml_diff>
--- a/templates/HDKT.docx
+++ b/templates/HDKT.docx
@@ -831,7 +831,7 @@
         <w:jc w:val="both"/>
       </w:pPr>
       <w:r>
-        <w:t>- Hàng có sẵn: giao trong vòng {sd1} – {sd2} ngày kể từ thời điểm Bên B nhận được khoản tạm ứng Lần 1 của Bên A.</w:t>
+        <w:t>{#giao_ds}</w:t>
       </w:r>
     </w:p>
     <w:p>
@@ -840,7 +840,16 @@
         <w:jc w:val="both"/>
       </w:pPr>
       <w:r>
-        <w:t>- Hàng đặt sản xuất/nhập khẩu: giao trong vòng {dh1} – {dh2} ngày kể từ thời điểm Bên B nhận được khoản tạm ứng Lần 1 của Bên A.</w:t>
+        <w:t>- Đợt {n}: Giao trong vòng {ngay} ngày kể từ thời điểm Bên B nhận được khoản tạm ứng của Bên A{them}.</w:t>
+      </w:r>
+    </w:p>
+    <w:p>
+      <w:pPr>
+        <w:spacing w:after="0"/>
+        <w:jc w:val="both"/>
+      </w:pPr>
+      <w:r>
+        <w:t>{/giao_ds}</w:t>
       </w:r>
     </w:p>
     <w:p>

</xml_diff>